<commit_message>
Transfering Sensor Data between Niclas
</commit_message>
<xml_diff>
--- a/Projekttagebuch.docx
+++ b/Projekttagebuch.docx
@@ -45,7 +45,20 @@
           <w:lang w:val="de-DE"/>
         </w:rPr>
         <w:br/>
-        <w:t>Nicla LED Test und Recherche über BLE (3 Stunden)</w:t>
+      </w:r>
+      <w:proofErr w:type="spellStart"/>
+      <w:r>
+        <w:rPr>
+          <w:lang w:val="de-DE"/>
+        </w:rPr>
+        <w:t>Nicla</w:t>
+      </w:r>
+      <w:proofErr w:type="spellEnd"/>
+      <w:r>
+        <w:rPr>
+          <w:lang w:val="de-DE"/>
+        </w:rPr>
+        <w:t xml:space="preserve"> LED Test und Recherche über BLE (3 Stunden)</w:t>
       </w:r>
     </w:p>
     <w:p>
@@ -65,7 +78,19 @@
           <w:lang w:val="de-DE"/>
         </w:rPr>
         <w:br/>
-        <w:t>Flutter Einstieg (3 Stunden)</w:t>
+        <w:t xml:space="preserve">Flutter </w:t>
+      </w:r>
+      <w:r>
+        <w:rPr>
+          <w:lang w:val="de-DE"/>
+        </w:rPr>
+        <w:t xml:space="preserve">&amp; Android Studio </w:t>
+      </w:r>
+      <w:r>
+        <w:rPr>
+          <w:lang w:val="de-DE"/>
+        </w:rPr>
+        <w:t>Einstieg (3 Stunden)</w:t>
       </w:r>
     </w:p>
     <w:p>
@@ -105,7 +130,20 @@
           <w:lang w:val="de-DE"/>
         </w:rPr>
         <w:br/>
-        <w:t>Nicla über BLE verbinden</w:t>
+      </w:r>
+      <w:proofErr w:type="spellStart"/>
+      <w:r>
+        <w:rPr>
+          <w:lang w:val="de-DE"/>
+        </w:rPr>
+        <w:t>Nicla</w:t>
+      </w:r>
+      <w:proofErr w:type="spellEnd"/>
+      <w:r>
+        <w:rPr>
+          <w:lang w:val="de-DE"/>
+        </w:rPr>
+        <w:t xml:space="preserve"> über BLE verbinden</w:t>
       </w:r>
       <w:r>
         <w:rPr>
@@ -130,6 +168,78 @@
           <w:lang w:val="de-DE"/>
         </w:rPr>
         <w:t xml:space="preserve"> Stunden)</w:t>
+      </w:r>
+    </w:p>
+    <w:p>
+      <w:pPr>
+        <w:rPr>
+          <w:lang w:val="de-DE"/>
+        </w:rPr>
+      </w:pPr>
+    </w:p>
+    <w:p>
+      <w:pPr>
+        <w:rPr>
+          <w:lang w:val="de-DE"/>
+        </w:rPr>
+      </w:pPr>
+      <w:r>
+        <w:rPr>
+          <w:lang w:val="de-DE"/>
+        </w:rPr>
+        <w:t>16.06.2025:</w:t>
+      </w:r>
+    </w:p>
+    <w:p>
+      <w:pPr>
+        <w:rPr>
+          <w:lang w:val="de-DE"/>
+        </w:rPr>
+      </w:pPr>
+      <w:r>
+        <w:rPr>
+          <w:lang w:val="de-DE"/>
+        </w:rPr>
+        <w:t>Daniel:</w:t>
+      </w:r>
+      <w:r>
+        <w:rPr>
+          <w:lang w:val="de-DE"/>
+        </w:rPr>
+        <w:br/>
+        <w:t>Sensordaten zwischen Niclas teilen (</w:t>
+      </w:r>
+      <w:r>
+        <w:rPr>
+          <w:lang w:val="de-DE"/>
+        </w:rPr>
+        <w:t>3</w:t>
+      </w:r>
+      <w:r>
+        <w:rPr>
+          <w:lang w:val="de-DE"/>
+        </w:rPr>
+        <w:t xml:space="preserve"> Stunden, 1 Stunde in Schule)</w:t>
+      </w:r>
+    </w:p>
+    <w:p>
+      <w:pPr>
+        <w:rPr>
+          <w:lang w:val="de-DE"/>
+        </w:rPr>
+      </w:pPr>
+      <w:r>
+        <w:rPr>
+          <w:lang w:val="de-DE"/>
+        </w:rPr>
+        <w:t>Kevin:</w:t>
+      </w:r>
+      <w:r>
+        <w:rPr>
+          <w:lang w:val="de-DE"/>
+        </w:rPr>
+        <w:br/>
+        <w:t>Flutter lernen (1 Stunde in Schule)</w:t>
       </w:r>
     </w:p>
     <w:sectPr>

</xml_diff>